<commit_message>
Update academic year to 2026-27 in report
Co-Authored-By: Claude Opus 5.5 <noreply@anthropic.com>
Claude-Session: https://claude.ai/code/session_01DP2bf5JSdcg2G8WKtQbPFu
</commit_message>
<xml_diff>
--- a/report/FitTracker_MAD_Complete_Report.docx
+++ b/report/FitTracker_MAD_Complete_Report.docx
@@ -36,7 +36,7 @@
           <w:sz w:val="28"/>
           <w:u w:val="none"/>
         </w:rPr>
-        <w:t>Academic Year 2025-26</w:t>
+        <w:t>Academic Year 2026-27</w:t>
       </w:r>
     </w:p>
     <w:p>
@@ -338,7 +338,7 @@
           <w:sz w:val="28"/>
           <w:u w:val="none"/>
         </w:rPr>
-        <w:t>Academic Year-2025-26</w:t>
+        <w:t>Academic Year-2026-27</w:t>
       </w:r>
     </w:p>
     <w:p>

</xml_diff>

<commit_message>
Add app screenshots to FitTracker report output section
Co-Authored-By: Claude Opus 5.5 <noreply@anthropic.com>
Claude-Session: https://claude.ai/code/session_01DP2bf5JSdcg2G8WKtQbPFu
</commit_message>
<xml_diff>
--- a/report/FitTracker_MAD_Complete_Report.docx
+++ b/report/FitTracker_MAD_Complete_Report.docx
@@ -12962,42 +12962,53 @@
         <w:gridCol w:w="4814"/>
       </w:tblGrid>
       <w:tr>
-        <w:trPr>
-          <w:trHeight w:val="11952"/>
-        </w:trPr>
         <w:tc>
           <w:tcPr>
             <w:tcW w:type="dxa" w:w="4752"/>
             <w:tcBorders>
-              <w:top w:val="single" w:sz="6" w:color="000000"/>
-              <w:left w:val="single" w:sz="6" w:color="000000"/>
-              <w:bottom w:val="single" w:sz="6" w:color="000000"/>
-              <w:right w:val="single" w:sz="6" w:color="000000"/>
+              <w:top w:val="single" w:sz="4" w:color="000000"/>
+              <w:left w:val="single" w:sz="4" w:color="000000"/>
+              <w:bottom w:val="single" w:sz="4" w:color="000000"/>
+              <w:right w:val="single" w:sz="4" w:color="000000"/>
             </w:tcBorders>
-            <w:vAlign w:val="center"/>
           </w:tcPr>
           <w:p>
             <w:pPr>
               <w:jc w:val="center"/>
             </w:pPr>
             <w:r>
-              <w:rPr>
-                <w:color w:val="808080"/>
-              </w:rPr>
-            </w:r>
-            <w:r>
-              <w:rPr>
-                <w:rFonts w:ascii="Times New Roman" w:hAnsi="Times New Roman" w:cs="Times New Roman" w:eastAsia="Times New Roman"/>
-                <w:b w:val="0"/>
-                <w:i w:val="0"/>
-                <w:color w:val="808080"/>
-                <w:sz w:val="24"/>
-                <w:u w:val="none"/>
-              </w:rPr>
-              <w:t>[Paste screenshot here]</w:t>
-              <w:br/>
-              <w:br/>
-              <w:t>Home Screen</w:t>
+              <w:drawing>
+                <wp:inline xmlns:a="http://schemas.openxmlformats.org/drawingml/2006/main" xmlns:pic="http://schemas.openxmlformats.org/drawingml/2006/picture">
+                  <wp:extent cx="2880360" cy="6400800"/>
+                  <wp:docPr id="4" name="Picture 4"/>
+                  <wp:cNvGraphicFramePr>
+                    <a:graphicFrameLocks noChangeAspect="1"/>
+                  </wp:cNvGraphicFramePr>
+                  <a:graphic>
+                    <a:graphicData uri="http://schemas.openxmlformats.org/drawingml/2006/picture">
+                      <pic:pic>
+                        <pic:nvPicPr>
+                          <pic:cNvPr id="0" name="fit_home.jpg"/>
+                          <pic:cNvPicPr/>
+                        </pic:nvPicPr>
+                        <pic:blipFill>
+                          <a:blip r:embed="rId12"/>
+                          <a:stretch>
+                            <a:fillRect/>
+                          </a:stretch>
+                        </pic:blipFill>
+                        <pic:spPr>
+                          <a:xfrm>
+                            <a:off x="0" y="0"/>
+                            <a:ext cx="2880360" cy="6400800"/>
+                          </a:xfrm>
+                          <a:prstGeom prst="rect"/>
+                        </pic:spPr>
+                      </pic:pic>
+                    </a:graphicData>
+                  </a:graphic>
+                </wp:inline>
+              </w:drawing>
             </w:r>
           </w:p>
         </w:tc>
@@ -13005,35 +13016,49 @@
           <w:tcPr>
             <w:tcW w:type="dxa" w:w="4752"/>
             <w:tcBorders>
-              <w:top w:val="single" w:sz="6" w:color="000000"/>
-              <w:left w:val="single" w:sz="6" w:color="000000"/>
-              <w:bottom w:val="single" w:sz="6" w:color="000000"/>
-              <w:right w:val="single" w:sz="6" w:color="000000"/>
+              <w:top w:val="single" w:sz="4" w:color="000000"/>
+              <w:left w:val="single" w:sz="4" w:color="000000"/>
+              <w:bottom w:val="single" w:sz="4" w:color="000000"/>
+              <w:right w:val="single" w:sz="4" w:color="000000"/>
             </w:tcBorders>
-            <w:vAlign w:val="center"/>
           </w:tcPr>
           <w:p>
             <w:pPr>
               <w:jc w:val="center"/>
             </w:pPr>
             <w:r>
-              <w:rPr>
-                <w:color w:val="808080"/>
-              </w:rPr>
-            </w:r>
-            <w:r>
-              <w:rPr>
-                <w:rFonts w:ascii="Times New Roman" w:hAnsi="Times New Roman" w:cs="Times New Roman" w:eastAsia="Times New Roman"/>
-                <w:b w:val="0"/>
-                <w:i w:val="0"/>
-                <w:color w:val="808080"/>
-                <w:sz w:val="24"/>
-                <w:u w:val="none"/>
-              </w:rPr>
-              <w:t>[Paste screenshot here]</w:t>
-              <w:br/>
-              <w:br/>
-              <w:t>Track Workout Screen</w:t>
+              <w:drawing>
+                <wp:inline xmlns:a="http://schemas.openxmlformats.org/drawingml/2006/main" xmlns:pic="http://schemas.openxmlformats.org/drawingml/2006/picture">
+                  <wp:extent cx="2880360" cy="6400800"/>
+                  <wp:docPr id="5" name="Picture 5"/>
+                  <wp:cNvGraphicFramePr>
+                    <a:graphicFrameLocks noChangeAspect="1"/>
+                  </wp:cNvGraphicFramePr>
+                  <a:graphic>
+                    <a:graphicData uri="http://schemas.openxmlformats.org/drawingml/2006/picture">
+                      <pic:pic>
+                        <pic:nvPicPr>
+                          <pic:cNvPr id="0" name="fit_home2.jpg"/>
+                          <pic:cNvPicPr/>
+                        </pic:nvPicPr>
+                        <pic:blipFill>
+                          <a:blip r:embed="rId13"/>
+                          <a:stretch>
+                            <a:fillRect/>
+                          </a:stretch>
+                        </pic:blipFill>
+                        <pic:spPr>
+                          <a:xfrm>
+                            <a:off x="0" y="0"/>
+                            <a:ext cx="2880360" cy="6400800"/>
+                          </a:xfrm>
+                          <a:prstGeom prst="rect"/>
+                        </pic:spPr>
+                      </pic:pic>
+                    </a:graphicData>
+                  </a:graphic>
+                </wp:inline>
+              </w:drawing>
             </w:r>
           </w:p>
         </w:tc>
@@ -13045,6 +13070,7 @@
           </w:tcPr>
           <w:p>
             <w:pPr>
+              <w:spacing w:before="120"/>
               <w:jc w:val="center"/>
             </w:pPr>
             <w:r/>
@@ -13066,6 +13092,154 @@
           </w:tcPr>
           <w:p>
             <w:pPr>
+              <w:spacing w:before="120"/>
+              <w:jc w:val="center"/>
+            </w:pPr>
+            <w:r/>
+            <w:r>
+              <w:rPr>
+                <w:rFonts w:ascii="Times New Roman" w:hAnsi="Times New Roman" w:cs="Times New Roman" w:eastAsia="Times New Roman"/>
+                <w:b/>
+                <w:i w:val="0"/>
+                <w:sz w:val="24"/>
+                <w:u w:val="none"/>
+              </w:rPr>
+              <w:t>Home Screen – Streak &amp; Weekly Chart</w:t>
+            </w:r>
+          </w:p>
+        </w:tc>
+      </w:tr>
+    </w:tbl>
+    <w:p>
+      <w:r>
+        <w:br w:type="page"/>
+      </w:r>
+    </w:p>
+    <w:p>
+      <w:pPr>
+        <w:spacing w:after="120" w:before="0" w:line="240" w:lineRule="auto"/>
+      </w:pPr>
+    </w:p>
+    <w:tbl>
+      <w:tblPr>
+        <w:tblW w:type="auto" w:w="0"/>
+        <w:jc w:val="center"/>
+        <w:tblLook w:firstColumn="1" w:firstRow="1" w:lastColumn="0" w:lastRow="0" w:noHBand="0" w:noVBand="1" w:val="04A0"/>
+      </w:tblPr>
+      <w:tblGrid>
+        <w:gridCol w:w="4814"/>
+        <w:gridCol w:w="4814"/>
+      </w:tblGrid>
+      <w:tr>
+        <w:tc>
+          <w:tcPr>
+            <w:tcW w:type="dxa" w:w="4752"/>
+            <w:tcBorders>
+              <w:top w:val="single" w:sz="4" w:color="000000"/>
+              <w:left w:val="single" w:sz="4" w:color="000000"/>
+              <w:bottom w:val="single" w:sz="4" w:color="000000"/>
+              <w:right w:val="single" w:sz="4" w:color="000000"/>
+            </w:tcBorders>
+          </w:tcPr>
+          <w:p>
+            <w:pPr>
+              <w:jc w:val="center"/>
+            </w:pPr>
+            <w:r>
+              <w:drawing>
+                <wp:inline xmlns:a="http://schemas.openxmlformats.org/drawingml/2006/main" xmlns:pic="http://schemas.openxmlformats.org/drawingml/2006/picture">
+                  <wp:extent cx="2880360" cy="6400800"/>
+                  <wp:docPr id="6" name="Picture 6"/>
+                  <wp:cNvGraphicFramePr>
+                    <a:graphicFrameLocks noChangeAspect="1"/>
+                  </wp:cNvGraphicFramePr>
+                  <a:graphic>
+                    <a:graphicData uri="http://schemas.openxmlformats.org/drawingml/2006/picture">
+                      <pic:pic>
+                        <pic:nvPicPr>
+                          <pic:cNvPr id="0" name="fit_workout.jpg"/>
+                          <pic:cNvPicPr/>
+                        </pic:nvPicPr>
+                        <pic:blipFill>
+                          <a:blip r:embed="rId14"/>
+                          <a:stretch>
+                            <a:fillRect/>
+                          </a:stretch>
+                        </pic:blipFill>
+                        <pic:spPr>
+                          <a:xfrm>
+                            <a:off x="0" y="0"/>
+                            <a:ext cx="2880360" cy="6400800"/>
+                          </a:xfrm>
+                          <a:prstGeom prst="rect"/>
+                        </pic:spPr>
+                      </pic:pic>
+                    </a:graphicData>
+                  </a:graphic>
+                </wp:inline>
+              </w:drawing>
+            </w:r>
+          </w:p>
+        </w:tc>
+        <w:tc>
+          <w:tcPr>
+            <w:tcW w:type="dxa" w:w="4752"/>
+            <w:tcBorders>
+              <w:top w:val="single" w:sz="4" w:color="000000"/>
+              <w:left w:val="single" w:sz="4" w:color="000000"/>
+              <w:bottom w:val="single" w:sz="4" w:color="000000"/>
+              <w:right w:val="single" w:sz="4" w:color="000000"/>
+            </w:tcBorders>
+          </w:tcPr>
+          <w:p>
+            <w:pPr>
+              <w:jc w:val="center"/>
+            </w:pPr>
+            <w:r>
+              <w:drawing>
+                <wp:inline xmlns:a="http://schemas.openxmlformats.org/drawingml/2006/main" xmlns:pic="http://schemas.openxmlformats.org/drawingml/2006/picture">
+                  <wp:extent cx="2880360" cy="6400800"/>
+                  <wp:docPr id="7" name="Picture 7"/>
+                  <wp:cNvGraphicFramePr>
+                    <a:graphicFrameLocks noChangeAspect="1"/>
+                  </wp:cNvGraphicFramePr>
+                  <a:graphic>
+                    <a:graphicData uri="http://schemas.openxmlformats.org/drawingml/2006/picture">
+                      <pic:pic>
+                        <pic:nvPicPr>
+                          <pic:cNvPr id="0" name="fit_journal.jpg"/>
+                          <pic:cNvPicPr/>
+                        </pic:nvPicPr>
+                        <pic:blipFill>
+                          <a:blip r:embed="rId15"/>
+                          <a:stretch>
+                            <a:fillRect/>
+                          </a:stretch>
+                        </pic:blipFill>
+                        <pic:spPr>
+                          <a:xfrm>
+                            <a:off x="0" y="0"/>
+                            <a:ext cx="2880360" cy="6400800"/>
+                          </a:xfrm>
+                          <a:prstGeom prst="rect"/>
+                        </pic:spPr>
+                      </pic:pic>
+                    </a:graphicData>
+                  </a:graphic>
+                </wp:inline>
+              </w:drawing>
+            </w:r>
+          </w:p>
+        </w:tc>
+      </w:tr>
+      <w:tr>
+        <w:tc>
+          <w:tcPr>
+            <w:tcW w:type="dxa" w:w="4752"/>
+          </w:tcPr>
+          <w:p>
+            <w:pPr>
+              <w:spacing w:before="120"/>
               <w:jc w:val="center"/>
             </w:pPr>
             <w:r/>
@@ -13081,128 +13255,13 @@
             </w:r>
           </w:p>
         </w:tc>
-      </w:tr>
-    </w:tbl>
-    <w:p>
-      <w:r>
-        <w:br w:type="page"/>
-      </w:r>
-    </w:p>
-    <w:tbl>
-      <w:tblPr>
-        <w:tblW w:type="auto" w:w="0"/>
-        <w:jc w:val="center"/>
-        <w:tblLook w:firstColumn="1" w:firstRow="1" w:lastColumn="0" w:lastRow="0" w:noHBand="0" w:noVBand="1" w:val="04A0"/>
-      </w:tblPr>
-      <w:tblGrid>
-        <w:gridCol w:w="4814"/>
-        <w:gridCol w:w="4814"/>
-      </w:tblGrid>
-      <w:tr>
-        <w:trPr>
-          <w:trHeight w:val="12528"/>
-        </w:trPr>
-        <w:tc>
-          <w:tcPr>
-            <w:tcW w:type="dxa" w:w="4752"/>
-            <w:tcBorders>
-              <w:top w:val="single" w:sz="6" w:color="000000"/>
-              <w:left w:val="single" w:sz="6" w:color="000000"/>
-              <w:bottom w:val="single" w:sz="6" w:color="000000"/>
-              <w:right w:val="single" w:sz="6" w:color="000000"/>
-            </w:tcBorders>
-            <w:vAlign w:val="center"/>
-          </w:tcPr>
-          <w:p>
-            <w:pPr>
-              <w:jc w:val="center"/>
-            </w:pPr>
-            <w:r>
-              <w:rPr>
-                <w:color w:val="808080"/>
-              </w:rPr>
-            </w:r>
-            <w:r>
-              <w:rPr>
-                <w:rFonts w:ascii="Times New Roman" w:hAnsi="Times New Roman" w:cs="Times New Roman" w:eastAsia="Times New Roman"/>
-                <w:b w:val="0"/>
-                <w:i w:val="0"/>
-                <w:color w:val="808080"/>
-                <w:sz w:val="24"/>
-                <w:u w:val="none"/>
-              </w:rPr>
-              <w:t>[Paste screenshot here]</w:t>
-              <w:br/>
-              <w:br/>
-              <w:t>Add Activity Screen</w:t>
-            </w:r>
-          </w:p>
-        </w:tc>
-        <w:tc>
-          <w:tcPr>
-            <w:tcW w:type="dxa" w:w="4752"/>
-            <w:tcBorders>
-              <w:top w:val="single" w:sz="6" w:color="000000"/>
-              <w:left w:val="single" w:sz="6" w:color="000000"/>
-              <w:bottom w:val="single" w:sz="6" w:color="000000"/>
-              <w:right w:val="single" w:sz="6" w:color="000000"/>
-            </w:tcBorders>
-            <w:vAlign w:val="center"/>
-          </w:tcPr>
-          <w:p>
-            <w:pPr>
-              <w:jc w:val="center"/>
-            </w:pPr>
-            <w:r>
-              <w:rPr>
-                <w:color w:val="808080"/>
-              </w:rPr>
-            </w:r>
-            <w:r>
-              <w:rPr>
-                <w:rFonts w:ascii="Times New Roman" w:hAnsi="Times New Roman" w:cs="Times New Roman" w:eastAsia="Times New Roman"/>
-                <w:b w:val="0"/>
-                <w:i w:val="0"/>
-                <w:color w:val="808080"/>
-                <w:sz w:val="24"/>
-                <w:u w:val="none"/>
-              </w:rPr>
-              <w:t>[Paste screenshot here]</w:t>
-              <w:br/>
-              <w:br/>
-              <w:t>Journal Screen</w:t>
-            </w:r>
-          </w:p>
-        </w:tc>
-      </w:tr>
-      <w:tr>
         <w:tc>
           <w:tcPr>
             <w:tcW w:type="dxa" w:w="4752"/>
           </w:tcPr>
           <w:p>
             <w:pPr>
-              <w:jc w:val="center"/>
-            </w:pPr>
-            <w:r/>
-            <w:r>
-              <w:rPr>
-                <w:rFonts w:ascii="Times New Roman" w:hAnsi="Times New Roman" w:cs="Times New Roman" w:eastAsia="Times New Roman"/>
-                <w:b/>
-                <w:i w:val="0"/>
-                <w:sz w:val="24"/>
-                <w:u w:val="none"/>
-              </w:rPr>
-              <w:t>Add Activity Screen</w:t>
-            </w:r>
-          </w:p>
-        </w:tc>
-        <w:tc>
-          <w:tcPr>
-            <w:tcW w:type="dxa" w:w="4752"/>
-          </w:tcPr>
-          <w:p>
-            <w:pPr>
+              <w:spacing w:before="120"/>
               <w:jc w:val="center"/>
             </w:pPr>
             <w:r/>
@@ -13225,6 +13284,11 @@
         <w:br w:type="page"/>
       </w:r>
     </w:p>
+    <w:p>
+      <w:pPr>
+        <w:spacing w:after="120" w:before="0" w:line="240" w:lineRule="auto"/>
+      </w:pPr>
+    </w:p>
     <w:tbl>
       <w:tblPr>
         <w:tblW w:type="auto" w:w="0"/>
@@ -13236,42 +13300,53 @@
         <w:gridCol w:w="4814"/>
       </w:tblGrid>
       <w:tr>
-        <w:trPr>
-          <w:trHeight w:val="12528"/>
-        </w:trPr>
         <w:tc>
           <w:tcPr>
             <w:tcW w:type="dxa" w:w="4752"/>
             <w:tcBorders>
-              <w:top w:val="single" w:sz="6" w:color="000000"/>
-              <w:left w:val="single" w:sz="6" w:color="000000"/>
-              <w:bottom w:val="single" w:sz="6" w:color="000000"/>
-              <w:right w:val="single" w:sz="6" w:color="000000"/>
+              <w:top w:val="single" w:sz="4" w:color="000000"/>
+              <w:left w:val="single" w:sz="4" w:color="000000"/>
+              <w:bottom w:val="single" w:sz="4" w:color="000000"/>
+              <w:right w:val="single" w:sz="4" w:color="000000"/>
             </w:tcBorders>
-            <w:vAlign w:val="center"/>
           </w:tcPr>
           <w:p>
             <w:pPr>
               <w:jc w:val="center"/>
             </w:pPr>
             <w:r>
-              <w:rPr>
-                <w:color w:val="808080"/>
-              </w:rPr>
-            </w:r>
-            <w:r>
-              <w:rPr>
-                <w:rFonts w:ascii="Times New Roman" w:hAnsi="Times New Roman" w:cs="Times New Roman" w:eastAsia="Times New Roman"/>
-                <w:b w:val="0"/>
-                <w:i w:val="0"/>
-                <w:color w:val="808080"/>
-                <w:sz w:val="24"/>
-                <w:u w:val="none"/>
-              </w:rPr>
-              <w:t>[Paste screenshot here]</w:t>
-              <w:br/>
-              <w:br/>
-              <w:t>Profile Screen</w:t>
+              <w:drawing>
+                <wp:inline xmlns:a="http://schemas.openxmlformats.org/drawingml/2006/main" xmlns:pic="http://schemas.openxmlformats.org/drawingml/2006/picture">
+                  <wp:extent cx="2880360" cy="6400800"/>
+                  <wp:docPr id="8" name="Picture 8"/>
+                  <wp:cNvGraphicFramePr>
+                    <a:graphicFrameLocks noChangeAspect="1"/>
+                  </wp:cNvGraphicFramePr>
+                  <a:graphic>
+                    <a:graphicData uri="http://schemas.openxmlformats.org/drawingml/2006/picture">
+                      <pic:pic>
+                        <pic:nvPicPr>
+                          <pic:cNvPr id="0" name="fit_profile.jpg"/>
+                          <pic:cNvPicPr/>
+                        </pic:nvPicPr>
+                        <pic:blipFill>
+                          <a:blip r:embed="rId16"/>
+                          <a:stretch>
+                            <a:fillRect/>
+                          </a:stretch>
+                        </pic:blipFill>
+                        <pic:spPr>
+                          <a:xfrm>
+                            <a:off x="0" y="0"/>
+                            <a:ext cx="2880360" cy="6400800"/>
+                          </a:xfrm>
+                          <a:prstGeom prst="rect"/>
+                        </pic:spPr>
+                      </pic:pic>
+                    </a:graphicData>
+                  </a:graphic>
+                </wp:inline>
+              </w:drawing>
             </w:r>
           </w:p>
         </w:tc>
@@ -13279,35 +13354,49 @@
           <w:tcPr>
             <w:tcW w:type="dxa" w:w="4752"/>
             <w:tcBorders>
-              <w:top w:val="single" w:sz="6" w:color="000000"/>
-              <w:left w:val="single" w:sz="6" w:color="000000"/>
-              <w:bottom w:val="single" w:sz="6" w:color="000000"/>
-              <w:right w:val="single" w:sz="6" w:color="000000"/>
+              <w:top w:val="single" w:sz="4" w:color="000000"/>
+              <w:left w:val="single" w:sz="4" w:color="000000"/>
+              <w:bottom w:val="single" w:sz="4" w:color="000000"/>
+              <w:right w:val="single" w:sz="4" w:color="000000"/>
             </w:tcBorders>
-            <w:vAlign w:val="center"/>
           </w:tcPr>
           <w:p>
             <w:pPr>
               <w:jc w:val="center"/>
             </w:pPr>
             <w:r>
-              <w:rPr>
-                <w:color w:val="808080"/>
-              </w:rPr>
-            </w:r>
-            <w:r>
-              <w:rPr>
-                <w:rFonts w:ascii="Times New Roman" w:hAnsi="Times New Roman" w:cs="Times New Roman" w:eastAsia="Times New Roman"/>
-                <w:b w:val="0"/>
-                <w:i w:val="0"/>
-                <w:color w:val="808080"/>
-                <w:sz w:val="24"/>
-                <w:u w:val="none"/>
-              </w:rPr>
-              <w:t>[Paste screenshot here]</w:t>
-              <w:br/>
-              <w:br/>
-              <w:t>Step Counter Notification</w:t>
+              <w:drawing>
+                <wp:inline xmlns:a="http://schemas.openxmlformats.org/drawingml/2006/main" xmlns:pic="http://schemas.openxmlformats.org/drawingml/2006/picture">
+                  <wp:extent cx="2880360" cy="6400800"/>
+                  <wp:docPr id="9" name="Picture 9"/>
+                  <wp:cNvGraphicFramePr>
+                    <a:graphicFrameLocks noChangeAspect="1"/>
+                  </wp:cNvGraphicFramePr>
+                  <a:graphic>
+                    <a:graphicData uri="http://schemas.openxmlformats.org/drawingml/2006/picture">
+                      <pic:pic>
+                        <pic:nvPicPr>
+                          <pic:cNvPr id="0" name="fit_notification.jpg"/>
+                          <pic:cNvPicPr/>
+                        </pic:nvPicPr>
+                        <pic:blipFill>
+                          <a:blip r:embed="rId17"/>
+                          <a:stretch>
+                            <a:fillRect/>
+                          </a:stretch>
+                        </pic:blipFill>
+                        <pic:spPr>
+                          <a:xfrm>
+                            <a:off x="0" y="0"/>
+                            <a:ext cx="2880360" cy="6400800"/>
+                          </a:xfrm>
+                          <a:prstGeom prst="rect"/>
+                        </pic:spPr>
+                      </pic:pic>
+                    </a:graphicData>
+                  </a:graphic>
+                </wp:inline>
+              </w:drawing>
             </w:r>
           </w:p>
         </w:tc>
@@ -13319,6 +13408,7 @@
           </w:tcPr>
           <w:p>
             <w:pPr>
+              <w:spacing w:before="120"/>
               <w:jc w:val="center"/>
             </w:pPr>
             <w:r/>
@@ -13340,6 +13430,7 @@
           </w:tcPr>
           <w:p>
             <w:pPr>
+              <w:spacing w:before="120"/>
               <w:jc w:val="center"/>
             </w:pPr>
             <w:r/>

</xml_diff>

<commit_message>
FitTracker certificate: add signature roles under names
Co-Authored-By: Claude Opus 5.5 <noreply@anthropic.com>
Claude-Session: https://claude.ai/code/session_01DP2bf5JSdcg2G8WKtQbPFu
</commit_message>
<xml_diff>
--- a/report/FitTracker_MAD_Complete_Report.docx
+++ b/report/FitTracker_MAD_Complete_Report.docx
@@ -611,47 +611,225 @@
     </w:p>
     <w:p>
       <w:pPr>
-        <w:spacing w:after="1200" w:before="0" w:line="240" w:lineRule="auto"/>
-      </w:pPr>
-    </w:p>
-    <w:p>
-      <w:pPr>
-        <w:spacing w:after="0" w:before="0" w:line="240" w:lineRule="auto"/>
-      </w:pPr>
-      <w:r>
-        <w:rPr>
-          <w:rFonts w:ascii="Times New Roman" w:hAnsi="Times New Roman" w:cs="Times New Roman" w:eastAsia="Times New Roman"/>
-          <w:b w:val="0"/>
-          <w:i w:val="0"/>
-          <w:sz w:val="24"/>
-          <w:u w:val="none"/>
-        </w:rPr>
-        <w:t>______________________        ______________________        ____________________</w:t>
-      </w:r>
-    </w:p>
-    <w:p>
-      <w:pPr>
-        <w:tabs>
-          <w:tab w:pos="3744" w:val="left"/>
-          <w:tab w:pos="7128" w:val="left"/>
-        </w:tabs>
-        <w:spacing w:after="0" w:before="280" w:line="240" w:lineRule="auto"/>
-      </w:pPr>
-      <w:r>
-        <w:rPr>
-          <w:rFonts w:ascii="Times New Roman" w:hAnsi="Times New Roman" w:cs="Times New Roman" w:eastAsia="Times New Roman"/>
-          <w:b/>
-          <w:i w:val="0"/>
-          <w:sz w:val="28"/>
-          <w:u w:val="none"/>
-        </w:rPr>
-        <w:t xml:space="preserve">  Smt.H.S.Pawar</w:t>
-        <w:tab/>
-        <w:t xml:space="preserve">   Smt.J.R.Hange</w:t>
-        <w:tab/>
-        <w:t xml:space="preserve">    Dr.R.K.Patil</w:t>
-      </w:r>
-    </w:p>
+        <w:spacing w:after="800" w:before="0" w:line="240" w:lineRule="auto"/>
+      </w:pPr>
+    </w:p>
+    <w:tbl>
+      <w:tblPr>
+        <w:tblW w:type="auto" w:w="0"/>
+        <w:jc w:val="center"/>
+        <w:tblLook w:firstColumn="1" w:firstRow="1" w:lastColumn="0" w:lastRow="0" w:noHBand="0" w:noVBand="1" w:val="04A0"/>
+      </w:tblPr>
+      <w:tblGrid>
+        <w:gridCol w:w="3120"/>
+        <w:gridCol w:w="3120"/>
+        <w:gridCol w:w="3120"/>
+      </w:tblGrid>
+      <w:tr>
+        <w:tc>
+          <w:tcPr>
+            <w:tcW w:type="dxa" w:w="3096"/>
+          </w:tcPr>
+          <w:p>
+            <w:pPr>
+              <w:spacing w:before="0"/>
+              <w:jc w:val="center"/>
+            </w:pPr>
+            <w:r/>
+            <w:r>
+              <w:rPr>
+                <w:rFonts w:ascii="Times New Roman" w:hAnsi="Times New Roman" w:cs="Times New Roman" w:eastAsia="Times New Roman"/>
+                <w:b w:val="0"/>
+                <w:i w:val="0"/>
+                <w:sz w:val="24"/>
+                <w:u w:val="none"/>
+              </w:rPr>
+              <w:t>_____________________</w:t>
+            </w:r>
+          </w:p>
+        </w:tc>
+        <w:tc>
+          <w:tcPr>
+            <w:tcW w:type="dxa" w:w="3096"/>
+          </w:tcPr>
+          <w:p>
+            <w:pPr>
+              <w:spacing w:before="0"/>
+              <w:jc w:val="center"/>
+            </w:pPr>
+            <w:r/>
+            <w:r>
+              <w:rPr>
+                <w:rFonts w:ascii="Times New Roman" w:hAnsi="Times New Roman" w:cs="Times New Roman" w:eastAsia="Times New Roman"/>
+                <w:b w:val="0"/>
+                <w:i w:val="0"/>
+                <w:sz w:val="24"/>
+                <w:u w:val="none"/>
+              </w:rPr>
+              <w:t>_____________________</w:t>
+            </w:r>
+          </w:p>
+        </w:tc>
+        <w:tc>
+          <w:tcPr>
+            <w:tcW w:type="dxa" w:w="3096"/>
+          </w:tcPr>
+          <w:p>
+            <w:pPr>
+              <w:spacing w:before="0"/>
+              <w:jc w:val="center"/>
+            </w:pPr>
+            <w:r/>
+            <w:r>
+              <w:rPr>
+                <w:rFonts w:ascii="Times New Roman" w:hAnsi="Times New Roman" w:cs="Times New Roman" w:eastAsia="Times New Roman"/>
+                <w:b w:val="0"/>
+                <w:i w:val="0"/>
+                <w:sz w:val="24"/>
+                <w:u w:val="none"/>
+              </w:rPr>
+              <w:t>_____________________</w:t>
+            </w:r>
+          </w:p>
+        </w:tc>
+      </w:tr>
+      <w:tr>
+        <w:tc>
+          <w:tcPr>
+            <w:tcW w:type="dxa" w:w="3096"/>
+          </w:tcPr>
+          <w:p>
+            <w:pPr>
+              <w:spacing w:before="240"/>
+              <w:jc w:val="center"/>
+            </w:pPr>
+            <w:r/>
+            <w:r>
+              <w:rPr>
+                <w:rFonts w:ascii="Times New Roman" w:hAnsi="Times New Roman" w:cs="Times New Roman" w:eastAsia="Times New Roman"/>
+                <w:b/>
+                <w:i w:val="0"/>
+                <w:sz w:val="28"/>
+                <w:u w:val="none"/>
+              </w:rPr>
+              <w:t>Smt.H.S.Pawar</w:t>
+            </w:r>
+          </w:p>
+        </w:tc>
+        <w:tc>
+          <w:tcPr>
+            <w:tcW w:type="dxa" w:w="3096"/>
+          </w:tcPr>
+          <w:p>
+            <w:pPr>
+              <w:spacing w:before="240"/>
+              <w:jc w:val="center"/>
+            </w:pPr>
+            <w:r/>
+            <w:r>
+              <w:rPr>
+                <w:rFonts w:ascii="Times New Roman" w:hAnsi="Times New Roman" w:cs="Times New Roman" w:eastAsia="Times New Roman"/>
+                <w:b/>
+                <w:i w:val="0"/>
+                <w:sz w:val="28"/>
+                <w:u w:val="none"/>
+              </w:rPr>
+              <w:t>Smt.J.R.Hange</w:t>
+            </w:r>
+          </w:p>
+        </w:tc>
+        <w:tc>
+          <w:tcPr>
+            <w:tcW w:type="dxa" w:w="3096"/>
+          </w:tcPr>
+          <w:p>
+            <w:pPr>
+              <w:spacing w:before="240"/>
+              <w:jc w:val="center"/>
+            </w:pPr>
+            <w:r/>
+            <w:r>
+              <w:rPr>
+                <w:rFonts w:ascii="Times New Roman" w:hAnsi="Times New Roman" w:cs="Times New Roman" w:eastAsia="Times New Roman"/>
+                <w:b/>
+                <w:i w:val="0"/>
+                <w:sz w:val="28"/>
+                <w:u w:val="none"/>
+              </w:rPr>
+              <w:t>Dr.R.K.Patil</w:t>
+            </w:r>
+          </w:p>
+        </w:tc>
+      </w:tr>
+      <w:tr>
+        <w:tc>
+          <w:tcPr>
+            <w:tcW w:type="dxa" w:w="3096"/>
+          </w:tcPr>
+          <w:p>
+            <w:pPr>
+              <w:spacing w:before="240"/>
+              <w:jc w:val="center"/>
+            </w:pPr>
+            <w:r/>
+            <w:r>
+              <w:rPr>
+                <w:rFonts w:ascii="Times New Roman" w:hAnsi="Times New Roman" w:cs="Times New Roman" w:eastAsia="Times New Roman"/>
+                <w:b/>
+                <w:i w:val="0"/>
+                <w:sz w:val="28"/>
+                <w:u w:val="none"/>
+              </w:rPr>
+              <w:t>(Microproject Guide)</w:t>
+            </w:r>
+          </w:p>
+        </w:tc>
+        <w:tc>
+          <w:tcPr>
+            <w:tcW w:type="dxa" w:w="3096"/>
+          </w:tcPr>
+          <w:p>
+            <w:pPr>
+              <w:spacing w:before="240"/>
+              <w:jc w:val="center"/>
+            </w:pPr>
+            <w:r/>
+            <w:r>
+              <w:rPr>
+                <w:rFonts w:ascii="Times New Roman" w:hAnsi="Times New Roman" w:cs="Times New Roman" w:eastAsia="Times New Roman"/>
+                <w:b/>
+                <w:i w:val="0"/>
+                <w:sz w:val="28"/>
+                <w:u w:val="none"/>
+              </w:rPr>
+              <w:t>(Head of Department)</w:t>
+            </w:r>
+          </w:p>
+        </w:tc>
+        <w:tc>
+          <w:tcPr>
+            <w:tcW w:type="dxa" w:w="3096"/>
+          </w:tcPr>
+          <w:p>
+            <w:pPr>
+              <w:spacing w:before="240"/>
+              <w:jc w:val="center"/>
+            </w:pPr>
+            <w:r/>
+            <w:r>
+              <w:rPr>
+                <w:rFonts w:ascii="Times New Roman" w:hAnsi="Times New Roman" w:cs="Times New Roman" w:eastAsia="Times New Roman"/>
+                <w:b/>
+                <w:i w:val="0"/>
+                <w:sz w:val="28"/>
+                <w:u w:val="none"/>
+              </w:rPr>
+              <w:t>(Principal)</w:t>
+            </w:r>
+          </w:p>
+        </w:tc>
+      </w:tr>
+    </w:tbl>
     <w:p>
       <w:r>
         <w:br w:type="page"/>

</xml_diff>

<commit_message>
FitTracker report: update enrollment number to 2406088
Co-Authored-By: Claude Opus 5.5 <noreply@anthropic.com>
Claude-Session: https://claude.ai/code/session_01DP2bf5JSdcg2G8WKtQbPFu
</commit_message>
<xml_diff>
--- a/report/FitTracker_MAD_Complete_Report.docx
+++ b/report/FitTracker_MAD_Complete_Report.docx
@@ -240,7 +240,7 @@
                 <w:sz w:val="24"/>
                 <w:u w:val="none"/>
               </w:rPr>
-              <w:t>2406085</w:t>
+              <w:t>2406088</w:t>
             </w:r>
           </w:p>
         </w:tc>
@@ -526,7 +526,7 @@
                 <w:sz w:val="24"/>
                 <w:u w:val="none"/>
               </w:rPr>
-              <w:t>2406085</w:t>
+              <w:t>2406088</w:t>
             </w:r>
           </w:p>
         </w:tc>

</xml_diff>